<commit_message>
updated all docs files
</commit_message>
<xml_diff>
--- a/docs/1PPS_flash_DE_Bedienungsanleitung_260302.docx
+++ b/docs/1PPS_flash_DE_Bedienungsanleitung_260302.docx
@@ -696,7 +696,13 @@
         </w:numPr>
       </w:pPr>
       <w:r>
-        <w:t>Betriebsdauer ca. 7 Stunden</w:t>
+        <w:t xml:space="preserve">Betriebsdauer ca. </w:t>
+      </w:r>
+      <w:r>
+        <w:t>6</w:t>
+      </w:r>
+      <w:r>
+        <w:t xml:space="preserve"> Stunden</w:t>
       </w:r>
     </w:p>
     <w:p>

</xml_diff>